<commit_message>
Report variance-explained on random-intercept basis
The random-slope sigma^2_u0 is centered at 2017 and trades off with the slope
variance/covariance, so its reduction is not bounded to [0,1] (Violations M2 read
-12.5%). Switch the augmented table's State-to-State Variation block to a
random-intercept-only decomposition (delta_pct_ri): Violations M2 +19.2%, M3
+38.4%; Inspections M2 +10.6%, M3 +6.4%. Coefficients still from the random-slope
paper spec. JSON keeps both delta_pct (rand-slope) and delta_pct_ri (rand-int).

Co-Authored-By: Claude Opus 4.8 (1M context) <noreply@anthropic.com>
</commit_message>
<xml_diff>
--- a/docs/WPS_Table_Sheels_augmented.docx
+++ b/docs/WPS_Table_Sheels_augmented.docx
@@ -2171,7 +2171,7 @@
                 <w:b/>
                 <w:sz w:val="18"/>
               </w:rPr>
-              <w:t>State-to-State Variation  (original → became)</w:t>
+              <w:t>State-to-State Variation — random-intercept basis  (original → became)</w:t>
             </w:r>
           </w:p>
         </w:tc>
@@ -2212,7 +2212,7 @@
                 <w:b w:val="0"/>
                 <w:sz w:val="18"/>
               </w:rPr>
-              <w:t>1.094 → 1.094</w:t>
+              <w:t>0.880 → 0.880</w:t>
             </w:r>
           </w:p>
         </w:tc>
@@ -2232,7 +2232,7 @@
                 <w:b w:val="0"/>
                 <w:sz w:val="18"/>
               </w:rPr>
-              <w:t>0.660 → 0.612</w:t>
+              <w:t>0.587 → 0.525</w:t>
             </w:r>
           </w:p>
         </w:tc>
@@ -2252,7 +2252,7 @@
                 <w:b w:val="0"/>
                 <w:sz w:val="18"/>
               </w:rPr>
-              <w:t>0.660 → 0.630</w:t>
+              <w:t>0.587 → 0.550</w:t>
             </w:r>
           </w:p>
         </w:tc>
@@ -2273,7 +2273,7 @@
                 <w:b w:val="0"/>
                 <w:sz w:val="18"/>
               </w:rPr>
-              <w:t xml:space="preserve">  σ²_u1  (between-state time slope)</w:t>
+              <w:t xml:space="preserve">  σ²_e   (within-state residual)</w:t>
             </w:r>
           </w:p>
         </w:tc>
@@ -2293,7 +2293,7 @@
                 <w:b w:val="0"/>
                 <w:sz w:val="18"/>
               </w:rPr>
-              <w:t>0.046 → 0.046</w:t>
+              <w:t>0.244 → 0.244</w:t>
             </w:r>
           </w:p>
         </w:tc>
@@ -2313,7 +2313,7 @@
                 <w:b w:val="0"/>
                 <w:sz w:val="18"/>
               </w:rPr>
-              <w:t>0.008 → 0.008</w:t>
+              <w:t>0.250 → 0.250</w:t>
             </w:r>
           </w:p>
         </w:tc>
@@ -2333,7 +2333,7 @@
                 <w:b w:val="0"/>
                 <w:sz w:val="18"/>
               </w:rPr>
-              <w:t>0.008 → 0.008</w:t>
+              <w:t>0.250 → 0.250</w:t>
             </w:r>
           </w:p>
         </w:tc>
@@ -2354,7 +2354,7 @@
                 <w:b w:val="0"/>
                 <w:sz w:val="18"/>
               </w:rPr>
-              <w:t xml:space="preserve">  σ_u01  (intercept–slope covariance)</w:t>
+              <w:t xml:space="preserve">  Δ σ²_u0 (between-state variance explained)</w:t>
             </w:r>
           </w:p>
         </w:tc>
@@ -2374,7 +2374,7 @@
                 <w:b w:val="0"/>
                 <w:sz w:val="18"/>
               </w:rPr>
-              <w:t>0.034 → 0.034</w:t>
+              <w:t>0.0%</w:t>
             </w:r>
           </w:p>
         </w:tc>
@@ -2394,7 +2394,7 @@
                 <w:b w:val="0"/>
                 <w:sz w:val="18"/>
               </w:rPr>
-              <w:t>0.024 → 0.028</w:t>
+              <w:t>10.6%</w:t>
             </w:r>
           </w:p>
         </w:tc>
@@ -2414,169 +2414,7 @@
                 <w:b w:val="0"/>
                 <w:sz w:val="18"/>
               </w:rPr>
-              <w:t>0.024 → 0.028</w:t>
-            </w:r>
-          </w:p>
-        </w:tc>
-      </w:tr>
-      <w:tr>
-        <w:tc>
-          <w:tcPr>
-            <w:tcW w:type="dxa" w:w="936"/>
-          </w:tcPr>
-          <w:p>
-            <w:pPr>
-              <w:jc w:val="left"/>
-            </w:pPr>
-            <w:r/>
-            <w:r>
-              <w:rPr>
-                <w:rFonts w:ascii="Helvetica" w:hAnsi="Helvetica"/>
-                <w:b w:val="0"/>
-                <w:sz w:val="18"/>
-              </w:rPr>
-              <w:t xml:space="preserve">  σ²_e   (within-state residual)</w:t>
-            </w:r>
-          </w:p>
-        </w:tc>
-        <w:tc>
-          <w:tcPr>
-            <w:tcW w:type="dxa" w:w="2808"/>
-            <w:gridSpan w:val="3"/>
-          </w:tcPr>
-          <w:p>
-            <w:pPr>
-              <w:jc w:val="center"/>
-            </w:pPr>
-            <w:r/>
-            <w:r>
-              <w:rPr>
-                <w:rFonts w:ascii="Helvetica" w:hAnsi="Helvetica"/>
-                <w:b w:val="0"/>
-                <w:sz w:val="18"/>
-              </w:rPr>
-              <w:t>0.165 → 0.165</w:t>
-            </w:r>
-          </w:p>
-        </w:tc>
-        <w:tc>
-          <w:tcPr>
-            <w:tcW w:type="dxa" w:w="2808"/>
-            <w:gridSpan w:val="3"/>
-          </w:tcPr>
-          <w:p>
-            <w:pPr>
-              <w:jc w:val="center"/>
-            </w:pPr>
-            <w:r/>
-            <w:r>
-              <w:rPr>
-                <w:rFonts w:ascii="Helvetica" w:hAnsi="Helvetica"/>
-                <w:b w:val="0"/>
-                <w:sz w:val="18"/>
-              </w:rPr>
-              <w:t>0.191 → 0.191</w:t>
-            </w:r>
-          </w:p>
-        </w:tc>
-        <w:tc>
-          <w:tcPr>
-            <w:tcW w:type="dxa" w:w="2808"/>
-            <w:gridSpan w:val="3"/>
-          </w:tcPr>
-          <w:p>
-            <w:pPr>
-              <w:jc w:val="center"/>
-            </w:pPr>
-            <w:r/>
-            <w:r>
-              <w:rPr>
-                <w:rFonts w:ascii="Helvetica" w:hAnsi="Helvetica"/>
-                <w:b w:val="0"/>
-                <w:sz w:val="18"/>
-              </w:rPr>
-              <w:t>0.191 → 0.192</w:t>
-            </w:r>
-          </w:p>
-        </w:tc>
-      </w:tr>
-      <w:tr>
-        <w:tc>
-          <w:tcPr>
-            <w:tcW w:type="dxa" w:w="936"/>
-          </w:tcPr>
-          <w:p>
-            <w:pPr>
-              <w:jc w:val="left"/>
-            </w:pPr>
-            <w:r/>
-            <w:r>
-              <w:rPr>
-                <w:rFonts w:ascii="Helvetica" w:hAnsi="Helvetica"/>
-                <w:b w:val="0"/>
-                <w:sz w:val="18"/>
-              </w:rPr>
-              <w:t xml:space="preserve">  Δ σ²_u0 (reduction vs baseline)</w:t>
-            </w:r>
-          </w:p>
-        </w:tc>
-        <w:tc>
-          <w:tcPr>
-            <w:tcW w:type="dxa" w:w="2808"/>
-            <w:gridSpan w:val="3"/>
-          </w:tcPr>
-          <w:p>
-            <w:pPr>
-              <w:jc w:val="center"/>
-            </w:pPr>
-            <w:r/>
-            <w:r>
-              <w:rPr>
-                <w:rFonts w:ascii="Helvetica" w:hAnsi="Helvetica"/>
-                <w:b w:val="0"/>
-                <w:sz w:val="18"/>
-              </w:rPr>
-              <w:t>0.0%</w:t>
-            </w:r>
-          </w:p>
-        </w:tc>
-        <w:tc>
-          <w:tcPr>
-            <w:tcW w:type="dxa" w:w="2808"/>
-            <w:gridSpan w:val="3"/>
-          </w:tcPr>
-          <w:p>
-            <w:pPr>
-              <w:jc w:val="center"/>
-            </w:pPr>
-            <w:r/>
-            <w:r>
-              <w:rPr>
-                <w:rFonts w:ascii="Helvetica" w:hAnsi="Helvetica"/>
-                <w:b w:val="0"/>
-                <w:sz w:val="18"/>
-              </w:rPr>
-              <w:t>7.3%</w:t>
-            </w:r>
-          </w:p>
-        </w:tc>
-        <w:tc>
-          <w:tcPr>
-            <w:tcW w:type="dxa" w:w="2808"/>
-            <w:gridSpan w:val="3"/>
-          </w:tcPr>
-          <w:p>
-            <w:pPr>
-              <w:jc w:val="center"/>
-            </w:pPr>
-            <w:r/>
-            <w:r>
-              <w:rPr>
-                <w:rFonts w:ascii="Helvetica" w:hAnsi="Helvetica"/>
-                <w:b w:val="0"/>
-                <w:sz w:val="18"/>
-              </w:rPr>
-              <w:t>4.6%</w:t>
+              <w:t>6.4%</w:t>
             </w:r>
           </w:p>
         </w:tc>
@@ -5203,7 +5041,7 @@
                 <w:b/>
                 <w:sz w:val="18"/>
               </w:rPr>
-              <w:t>State-to-State Variation  (original → became)</w:t>
+              <w:t>State-to-State Variation — random-intercept basis  (original → became)</w:t>
             </w:r>
           </w:p>
         </w:tc>
@@ -5244,7 +5082,7 @@
                 <w:b w:val="0"/>
                 <w:sz w:val="18"/>
               </w:rPr>
-              <w:t>0.632 → 0.632</w:t>
+              <w:t>0.532 → 0.532</w:t>
             </w:r>
           </w:p>
         </w:tc>
@@ -5264,7 +5102,7 @@
                 <w:b w:val="0"/>
                 <w:sz w:val="18"/>
               </w:rPr>
-              <w:t>0.636 → 0.715</w:t>
+              <w:t>0.537 → 0.434</w:t>
             </w:r>
           </w:p>
         </w:tc>
@@ -5284,7 +5122,7 @@
                 <w:b w:val="0"/>
                 <w:sz w:val="18"/>
               </w:rPr>
-              <w:t>0.636 → 0.402</w:t>
+              <w:t>0.537 → 0.331</w:t>
             </w:r>
           </w:p>
         </w:tc>
@@ -5305,7 +5143,7 @@
                 <w:b w:val="0"/>
                 <w:sz w:val="18"/>
               </w:rPr>
-              <w:t xml:space="preserve">  σ²_u1  (between-state time slope)</w:t>
+              <w:t xml:space="preserve">  σ²_e   (within-state residual)</w:t>
             </w:r>
           </w:p>
         </w:tc>
@@ -5325,7 +5163,7 @@
                 <w:b w:val="0"/>
                 <w:sz w:val="18"/>
               </w:rPr>
-              <w:t>0.004 → 0.004</w:t>
+              <w:t>0.323 → 0.323</w:t>
             </w:r>
           </w:p>
         </w:tc>
@@ -5345,7 +5183,7 @@
                 <w:b w:val="0"/>
                 <w:sz w:val="18"/>
               </w:rPr>
-              <w:t>0.004 → 0.005</w:t>
+              <w:t>0.328 → 0.328</w:t>
             </w:r>
           </w:p>
         </w:tc>
@@ -5365,7 +5203,7 @@
                 <w:b w:val="0"/>
                 <w:sz w:val="18"/>
               </w:rPr>
-              <w:t>0.004 → 0.004</w:t>
+              <w:t>0.328 → 0.329</w:t>
             </w:r>
           </w:p>
         </w:tc>
@@ -5386,7 +5224,7 @@
                 <w:b w:val="0"/>
                 <w:sz w:val="18"/>
               </w:rPr>
-              <w:t xml:space="preserve">  σ_u01  (intercept–slope covariance)</w:t>
+              <w:t xml:space="preserve">  Δ σ²_u0 (between-state variance explained)</w:t>
             </w:r>
           </w:p>
         </w:tc>
@@ -5406,7 +5244,7 @@
                 <w:b w:val="0"/>
                 <w:sz w:val="18"/>
               </w:rPr>
-              <w:t>0.036 → 0.036</w:t>
+              <w:t>0.0%</w:t>
             </w:r>
           </w:p>
         </w:tc>
@@ -5426,7 +5264,7 @@
                 <w:b w:val="0"/>
                 <w:sz w:val="18"/>
               </w:rPr>
-              <w:t>0.035 → 0.047</w:t>
+              <w:t>19.2%</w:t>
             </w:r>
           </w:p>
         </w:tc>
@@ -5446,169 +5284,7 @@
                 <w:b w:val="0"/>
                 <w:sz w:val="18"/>
               </w:rPr>
-              <w:t>0.035 → 0.026</w:t>
-            </w:r>
-          </w:p>
-        </w:tc>
-      </w:tr>
-      <w:tr>
-        <w:tc>
-          <w:tcPr>
-            <w:tcW w:type="dxa" w:w="936"/>
-          </w:tcPr>
-          <w:p>
-            <w:pPr>
-              <w:jc w:val="left"/>
-            </w:pPr>
-            <w:r/>
-            <w:r>
-              <w:rPr>
-                <w:rFonts w:ascii="Helvetica" w:hAnsi="Helvetica"/>
-                <w:b w:val="0"/>
-                <w:sz w:val="18"/>
-              </w:rPr>
-              <w:t xml:space="preserve">  σ²_e   (within-state residual)</w:t>
-            </w:r>
-          </w:p>
-        </w:tc>
-        <w:tc>
-          <w:tcPr>
-            <w:tcW w:type="dxa" w:w="2808"/>
-            <w:gridSpan w:val="3"/>
-          </w:tcPr>
-          <w:p>
-            <w:pPr>
-              <w:jc w:val="center"/>
-            </w:pPr>
-            <w:r/>
-            <w:r>
-              <w:rPr>
-                <w:rFonts w:ascii="Helvetica" w:hAnsi="Helvetica"/>
-                <w:b w:val="0"/>
-                <w:sz w:val="18"/>
-              </w:rPr>
-              <w:t>0.296 → 0.296</w:t>
-            </w:r>
-          </w:p>
-        </w:tc>
-        <w:tc>
-          <w:tcPr>
-            <w:tcW w:type="dxa" w:w="2808"/>
-            <w:gridSpan w:val="3"/>
-          </w:tcPr>
-          <w:p>
-            <w:pPr>
-              <w:jc w:val="center"/>
-            </w:pPr>
-            <w:r/>
-            <w:r>
-              <w:rPr>
-                <w:rFonts w:ascii="Helvetica" w:hAnsi="Helvetica"/>
-                <w:b w:val="0"/>
-                <w:sz w:val="18"/>
-              </w:rPr>
-              <w:t>0.301 → 0.295</w:t>
-            </w:r>
-          </w:p>
-        </w:tc>
-        <w:tc>
-          <w:tcPr>
-            <w:tcW w:type="dxa" w:w="2808"/>
-            <w:gridSpan w:val="3"/>
-          </w:tcPr>
-          <w:p>
-            <w:pPr>
-              <w:jc w:val="center"/>
-            </w:pPr>
-            <w:r/>
-            <w:r>
-              <w:rPr>
-                <w:rFonts w:ascii="Helvetica" w:hAnsi="Helvetica"/>
-                <w:b w:val="0"/>
-                <w:sz w:val="18"/>
-              </w:rPr>
-              <w:t>0.301 → 0.302</w:t>
-            </w:r>
-          </w:p>
-        </w:tc>
-      </w:tr>
-      <w:tr>
-        <w:tc>
-          <w:tcPr>
-            <w:tcW w:type="dxa" w:w="936"/>
-          </w:tcPr>
-          <w:p>
-            <w:pPr>
-              <w:jc w:val="left"/>
-            </w:pPr>
-            <w:r/>
-            <w:r>
-              <w:rPr>
-                <w:rFonts w:ascii="Helvetica" w:hAnsi="Helvetica"/>
-                <w:b w:val="0"/>
-                <w:sz w:val="18"/>
-              </w:rPr>
-              <w:t xml:space="preserve">  Δ σ²_u0 (reduction vs baseline)</w:t>
-            </w:r>
-          </w:p>
-        </w:tc>
-        <w:tc>
-          <w:tcPr>
-            <w:tcW w:type="dxa" w:w="2808"/>
-            <w:gridSpan w:val="3"/>
-          </w:tcPr>
-          <w:p>
-            <w:pPr>
-              <w:jc w:val="center"/>
-            </w:pPr>
-            <w:r/>
-            <w:r>
-              <w:rPr>
-                <w:rFonts w:ascii="Helvetica" w:hAnsi="Helvetica"/>
-                <w:b w:val="0"/>
-                <w:sz w:val="18"/>
-              </w:rPr>
-              <w:t>0.0%</w:t>
-            </w:r>
-          </w:p>
-        </w:tc>
-        <w:tc>
-          <w:tcPr>
-            <w:tcW w:type="dxa" w:w="2808"/>
-            <w:gridSpan w:val="3"/>
-          </w:tcPr>
-          <w:p>
-            <w:pPr>
-              <w:jc w:val="center"/>
-            </w:pPr>
-            <w:r/>
-            <w:r>
-              <w:rPr>
-                <w:rFonts w:ascii="Helvetica" w:hAnsi="Helvetica"/>
-                <w:b w:val="0"/>
-                <w:sz w:val="18"/>
-              </w:rPr>
-              <w:t>-12.5%</w:t>
-            </w:r>
-          </w:p>
-        </w:tc>
-        <w:tc>
-          <w:tcPr>
-            <w:tcW w:type="dxa" w:w="2808"/>
-            <w:gridSpan w:val="3"/>
-          </w:tcPr>
-          <w:p>
-            <w:pPr>
-              <w:jc w:val="center"/>
-            </w:pPr>
-            <w:r/>
-            <w:r>
-              <w:rPr>
-                <w:rFonts w:ascii="Helvetica" w:hAnsi="Helvetica"/>
-                <w:b w:val="0"/>
-                <w:sz w:val="18"/>
-              </w:rPr>
-              <w:t>36.8%</w:t>
+              <w:t>38.4%</w:t>
             </w:r>
           </w:p>
         </w:tc>
@@ -5890,7 +5566,7 @@
           <w:rFonts w:ascii="Helvetica" w:hAnsi="Helvetica"/>
           <w:sz w:val="18"/>
         </w:rPr>
-        <w:t>Each model reports the unstandardized coefficient b, its standard error (SE), and the fully standardized coefficient β = b·SD(x)/SD(y), with SDs taken on that column's own analytic sample. β for the time polynomials and log(Inspections+1) is reported for completeness but is of limited interpretive value. The State-to-State Variation block shows each random-effects component as the value under a time-only baseline (re-estimated on the same sample) → the value under the fitted model; Δ σ²_u0 is the percent reduction in between-state intercept variance. A negative Δ (e.g., Violations Model 2) means the added Level-2 predictors raised between-state intercept variance on that sample — a genuine suppression/reallocation effect given the correlated random slope, not a sign error. Both outcomes are log(count+1); the violations model includes log(inspections+1) as a contemporaneous predictor. Spending variables use mean 2011–2019 STAG obligations over mean 2011–2019 BLS employment; MS/RI/WV (like HI/TN/UT) received no CFDA 66.700 obligations and are coded $0. AK/RI/VT drop from Spending/applicator columns (BLS never publishes SOC 37-3012 for them), giving N=47 states. + p&lt;.10, * p&lt;.05, ** p&lt;.01, *** p&lt;.001.</w:t>
+        <w:t>Each model reports the unstandardized coefficient b, its standard error (SE), and the fully standardized coefficient β = b·SD(x)/SD(y), with SDs taken on that column's own analytic sample. β for the time polynomials and log(Inspections+1) is reported for completeness but is of limited interpretive value. Coefficients (b, SE, β) come from the paper spec — a random intercept plus a random linear-time slope by state. The State-to-State Variation block is instead read from random-INTERCEPT-only models (baseline and fitted, same sample): it shows σ²_u0 and the residual σ²_e as the value under a time-only baseline → the value under the fitted model, and Δ σ²_u0 as the percent of between-state intercept variance explained. The random-intercept basis is used here because in the random-slope model σ²_u0 is the between-state variance at the centering year (2017) and trades off against the slope variance/covariance, so its reduction is not bounded to [0,1]; the random-intercept statistic is the conventional between-state variance-explained. Both outcomes are log(count+1); the violations model includes log(inspections+1) as a contemporaneous predictor. Spending variables use mean 2011–2019 STAG obligations over mean 2011–2019 BLS employment; MS/RI/WV (like HI/TN/UT) received no CFDA 66.700 obligations and are coded $0. AK/RI/VT drop from Spending/applicator columns (BLS never publishes SOC 37-3012 for them), giving N=47 states. + p&lt;.10, * p&lt;.05, ** p&lt;.01, *** p&lt;.001.</w:t>
       </w:r>
     </w:p>
     <w:sectPr>

</xml_diff>

<commit_message>
Variance %-change references a single Model-1 baseline
Team direction: every column's between-state variance reduction should start
from Model 1's sigma^2, not a same-sample refit. delta_pct_ri / sigma2_u0_ri_baseline
now use M1's random-intercept sigma^2 as the common origin -> Inspections M2/M3
40.3%/37.5%, Violations 18.4%/37.8%; M1 = 0%. Same-sample values kept under
*_matched. Both docx notes flag that inspections M2/M3 drop AK/RI/VT (high-variance
states), so part of that reduction reflects the narrower sample; violations unaffected.

Co-Authored-By: Claude Opus 4.8 (1M context) <noreply@anthropic.com>
</commit_message>
<xml_diff>
--- a/docs/WPS_Table_Sheels_augmented.docx
+++ b/docs/WPS_Table_Sheels_augmented.docx
@@ -2171,7 +2171,7 @@
                 <w:b/>
                 <w:sz w:val="18"/>
               </w:rPr>
-              <w:t>State-to-State Variation — random-intercept basis  (original → became)</w:t>
+              <w:t>State-to-State Variation — random-intercept basis  (Model 1 baseline → model)</w:t>
             </w:r>
           </w:p>
         </w:tc>
@@ -2232,7 +2232,7 @@
                 <w:b w:val="0"/>
                 <w:sz w:val="18"/>
               </w:rPr>
-              <w:t>0.587 → 0.525</w:t>
+              <w:t>0.880 → 0.525</w:t>
             </w:r>
           </w:p>
         </w:tc>
@@ -2252,7 +2252,7 @@
                 <w:b w:val="0"/>
                 <w:sz w:val="18"/>
               </w:rPr>
-              <w:t>0.587 → 0.550</w:t>
+              <w:t>0.880 → 0.550</w:t>
             </w:r>
           </w:p>
         </w:tc>
@@ -2313,7 +2313,7 @@
                 <w:b w:val="0"/>
                 <w:sz w:val="18"/>
               </w:rPr>
-              <w:t>0.250 → 0.250</w:t>
+              <w:t>0.244 → 0.250</w:t>
             </w:r>
           </w:p>
         </w:tc>
@@ -2333,7 +2333,7 @@
                 <w:b w:val="0"/>
                 <w:sz w:val="18"/>
               </w:rPr>
-              <w:t>0.250 → 0.250</w:t>
+              <w:t>0.244 → 0.250</w:t>
             </w:r>
           </w:p>
         </w:tc>
@@ -2394,7 +2394,7 @@
                 <w:b w:val="0"/>
                 <w:sz w:val="18"/>
               </w:rPr>
-              <w:t>10.6%</w:t>
+              <w:t>40.3%</w:t>
             </w:r>
           </w:p>
         </w:tc>
@@ -2414,7 +2414,7 @@
                 <w:b w:val="0"/>
                 <w:sz w:val="18"/>
               </w:rPr>
-              <w:t>6.4%</w:t>
+              <w:t>37.5%</w:t>
             </w:r>
           </w:p>
         </w:tc>
@@ -5041,7 +5041,7 @@
                 <w:b/>
                 <w:sz w:val="18"/>
               </w:rPr>
-              <w:t>State-to-State Variation — random-intercept basis  (original → became)</w:t>
+              <w:t>State-to-State Variation — random-intercept basis  (Model 1 baseline → model)</w:t>
             </w:r>
           </w:p>
         </w:tc>
@@ -5102,7 +5102,7 @@
                 <w:b w:val="0"/>
                 <w:sz w:val="18"/>
               </w:rPr>
-              <w:t>0.537 → 0.434</w:t>
+              <w:t>0.532 → 0.434</w:t>
             </w:r>
           </w:p>
         </w:tc>
@@ -5122,7 +5122,7 @@
                 <w:b w:val="0"/>
                 <w:sz w:val="18"/>
               </w:rPr>
-              <w:t>0.537 → 0.331</w:t>
+              <w:t>0.532 → 0.331</w:t>
             </w:r>
           </w:p>
         </w:tc>
@@ -5183,7 +5183,7 @@
                 <w:b w:val="0"/>
                 <w:sz w:val="18"/>
               </w:rPr>
-              <w:t>0.328 → 0.328</w:t>
+              <w:t>0.323 → 0.328</w:t>
             </w:r>
           </w:p>
         </w:tc>
@@ -5203,7 +5203,7 @@
                 <w:b w:val="0"/>
                 <w:sz w:val="18"/>
               </w:rPr>
-              <w:t>0.328 → 0.329</w:t>
+              <w:t>0.323 → 0.329</w:t>
             </w:r>
           </w:p>
         </w:tc>
@@ -5264,7 +5264,7 @@
                 <w:b w:val="0"/>
                 <w:sz w:val="18"/>
               </w:rPr>
-              <w:t>19.2%</w:t>
+              <w:t>18.4%</w:t>
             </w:r>
           </w:p>
         </w:tc>
@@ -5284,7 +5284,7 @@
                 <w:b w:val="0"/>
                 <w:sz w:val="18"/>
               </w:rPr>
-              <w:t>38.4%</w:t>
+              <w:t>37.8%</w:t>
             </w:r>
           </w:p>
         </w:tc>
@@ -5566,7 +5566,7 @@
           <w:rFonts w:ascii="Helvetica" w:hAnsi="Helvetica"/>
           <w:sz w:val="18"/>
         </w:rPr>
-        <w:t>Each model reports the unstandardized coefficient b, its standard error (SE), and the fully standardized coefficient β = b·SD(x)/SD(y), with SDs taken on that column's own analytic sample. β for the time polynomials and log(Inspections+1) is reported for completeness but is of limited interpretive value. Coefficients (b, SE, β) come from the paper spec — a random intercept plus a random linear-time slope by state. The State-to-State Variation block is instead read from random-INTERCEPT-only models (baseline and fitted, same sample): it shows σ²_u0 and the residual σ²_e as the value under a time-only baseline → the value under the fitted model, and Δ σ²_u0 as the percent of between-state intercept variance explained. The random-intercept basis is used here because in the random-slope model σ²_u0 is the between-state variance at the centering year (2017) and trades off against the slope variance/covariance, so its reduction is not bounded to [0,1]; the random-intercept statistic is the conventional between-state variance-explained. Both outcomes are log(count+1); the violations model includes log(inspections+1) as a contemporaneous predictor. Spending variables use mean 2011–2019 STAG obligations over mean 2011–2019 BLS employment; MS/RI/WV (like HI/TN/UT) received no CFDA 66.700 obligations and are coded $0. AK/RI/VT drop from Spending/applicator columns (BLS never publishes SOC 37-3012 for them), giving N=47 states. + p&lt;.10, * p&lt;.05, ** p&lt;.01, *** p&lt;.001.</w:t>
+        <w:t>Each model reports the unstandardized coefficient b, its standard error (SE), and the fully standardized coefficient β = b·SD(x)/SD(y), with SDs taken on that column's own analytic sample. β for the time polynomials and log(Inspections+1) is reported for completeness but is of limited interpretive value. Coefficients (b, SE, β) come from the paper spec — a random intercept plus a random linear-time slope by state. The State-to-State Variation block is read from random-INTERCEPT-only models. Every column is referenced to the same Model 1 baseline (Model 1’s σ²): the σ²_u0 and σ²_e rows show that Model 1 value → the value under the fitted model, and Δ σ²_u0 is the percent of Model 1 between-state intercept variance explained. The random-intercept basis is used because in the random-slope model σ²_u0 is the between-state variance at the centering year (2017) and trades off against the slope variance/covariance, so its reduction is not bounded to [0,1]. Note: in the inspections table, Models 2–3 omit Alaska, Rhode Island, and Vermont (no BLS applicator data), and those three states carry much of the between-state inspection variance, so part of that column’s reduction against Model 1 reflects the narrower sample as well as the covariates; the violations table is unaffected. Both outcomes are log(count+1); the violations model includes log(inspections+1) as a contemporaneous predictor. Spending variables use mean 2011–2019 STAG obligations over mean 2011–2019 BLS employment; MS/RI/WV (like HI/TN/UT) received no CFDA 66.700 obligations and are coded $0. AK/RI/VT drop from Spending/applicator columns (BLS never publishes SOC 37-3012 for them), giving N=47 states. + p&lt;.10, * p&lt;.05, ** p&lt;.01, *** p&lt;.001.</w:t>
       </w:r>
     </w:p>
     <w:sectPr>

</xml_diff>

<commit_message>
Apply the convergence fix to the 2019 arm and regenerate its tables
Same treatment as paper_table_models_2021.py: no blanket warning filter, an
optimizer ladder keeping the first cleanly-converged fit, and a fallback report.

Exactly 2 fits were broken, independently confirming validate_count_models.py
item 5's prediction. The inspections M1 error is 19.8 log-likelihood units --
more than twice the worst case in the 2021 window.

The printed changes matter more here than in 2021: inspections M1 time goes
-0.069* -> -0.069*** as its SE nearly halves, violations M2 SPEND_APP_z moves
from null to marginally significant, and lii_2017_z flips sign (+0.039 ->
-0.005, non-significant either way). Zero published *_ri values change, so the
variance-explained block is again unaffected.

Co-Authored-By: Claude Opus 5 (1M context) <noreply@anthropic.com>
</commit_message>
<xml_diff>
--- a/docs/WPS_Table_Sheels_augmented.docx
+++ b/docs/WPS_Table_Sheels_augmented.docx
@@ -364,26 +364,26 @@
                 <w:b w:val="0"/>
                 <w:sz w:val="18"/>
               </w:rPr>
-              <w:t>-0.069*</w:t>
-            </w:r>
-          </w:p>
-        </w:tc>
-        <w:tc>
-          <w:tcPr>
-            <w:tcW w:type="dxa" w:w="936"/>
-          </w:tcPr>
-          <w:p>
-            <w:pPr>
-              <w:jc w:val="center"/>
-            </w:pPr>
-            <w:r/>
-            <w:r>
-              <w:rPr>
-                <w:rFonts w:ascii="Helvetica" w:hAnsi="Helvetica"/>
-                <w:b w:val="0"/>
-                <w:sz w:val="18"/>
-              </w:rPr>
-              <w:t>(0.034)</w:t>
+              <w:t>-0.069***</w:t>
+            </w:r>
+          </w:p>
+        </w:tc>
+        <w:tc>
+          <w:tcPr>
+            <w:tcW w:type="dxa" w:w="936"/>
+          </w:tcPr>
+          <w:p>
+            <w:pPr>
+              <w:jc w:val="center"/>
+            </w:pPr>
+            <w:r/>
+            <w:r>
+              <w:rPr>
+                <w:rFonts w:ascii="Helvetica" w:hAnsi="Helvetica"/>
+                <w:b w:val="0"/>
+                <w:sz w:val="18"/>
+              </w:rPr>
+              <w:t>(0.020)</w:t>
             </w:r>
           </w:p>
         </w:tc>
@@ -3099,7 +3099,7 @@
                 <w:b w:val="0"/>
                 <w:sz w:val="18"/>
               </w:rPr>
-              <w:t>0.172**</w:t>
+              <w:t>0.178**</w:t>
             </w:r>
           </w:p>
         </w:tc>
@@ -3137,7 +3137,7 @@
                 <w:b w:val="0"/>
                 <w:sz w:val="18"/>
               </w:rPr>
-              <w:t>0.156</w:t>
+              <w:t>0.161</w:t>
             </w:r>
           </w:p>
         </w:tc>
@@ -3329,7 +3329,7 @@
                 <w:b w:val="0"/>
                 <w:sz w:val="18"/>
               </w:rPr>
-              <w:t>0.543</w:t>
+              <w:t>0.544</w:t>
             </w:r>
           </w:p>
         </w:tc>
@@ -3521,7 +3521,7 @@
                 <w:b w:val="0"/>
                 <w:sz w:val="18"/>
               </w:rPr>
-              <w:t>-0.298</w:t>
+              <w:t>-0.299</w:t>
             </w:r>
           </w:p>
         </w:tc>
@@ -3926,45 +3926,45 @@
                 <w:b w:val="0"/>
                 <w:sz w:val="18"/>
               </w:rPr>
-              <w:t>-0.159</w:t>
-            </w:r>
-          </w:p>
-        </w:tc>
-        <w:tc>
-          <w:tcPr>
-            <w:tcW w:type="dxa" w:w="936"/>
-          </w:tcPr>
-          <w:p>
-            <w:pPr>
-              <w:jc w:val="center"/>
-            </w:pPr>
-            <w:r/>
-            <w:r>
-              <w:rPr>
-                <w:rFonts w:ascii="Helvetica" w:hAnsi="Helvetica"/>
-                <w:b w:val="0"/>
-                <w:sz w:val="18"/>
-              </w:rPr>
-              <w:t>(0.108)</w:t>
-            </w:r>
-          </w:p>
-        </w:tc>
-        <w:tc>
-          <w:tcPr>
-            <w:tcW w:type="dxa" w:w="936"/>
-          </w:tcPr>
-          <w:p>
-            <w:pPr>
-              <w:jc w:val="center"/>
-            </w:pPr>
-            <w:r/>
-            <w:r>
-              <w:rPr>
-                <w:rFonts w:ascii="Helvetica" w:hAnsi="Helvetica"/>
-                <w:b w:val="0"/>
-                <w:sz w:val="18"/>
-              </w:rPr>
-              <w:t>-0.154</w:t>
+              <w:t>-0.172+</w:t>
+            </w:r>
+          </w:p>
+        </w:tc>
+        <w:tc>
+          <w:tcPr>
+            <w:tcW w:type="dxa" w:w="936"/>
+          </w:tcPr>
+          <w:p>
+            <w:pPr>
+              <w:jc w:val="center"/>
+            </w:pPr>
+            <w:r/>
+            <w:r>
+              <w:rPr>
+                <w:rFonts w:ascii="Helvetica" w:hAnsi="Helvetica"/>
+                <w:b w:val="0"/>
+                <w:sz w:val="18"/>
+              </w:rPr>
+              <w:t>(0.102)</w:t>
+            </w:r>
+          </w:p>
+        </w:tc>
+        <w:tc>
+          <w:tcPr>
+            <w:tcW w:type="dxa" w:w="936"/>
+          </w:tcPr>
+          <w:p>
+            <w:pPr>
+              <w:jc w:val="center"/>
+            </w:pPr>
+            <w:r/>
+            <w:r>
+              <w:rPr>
+                <w:rFonts w:ascii="Helvetica" w:hAnsi="Helvetica"/>
+                <w:b w:val="0"/>
+                <w:sz w:val="18"/>
+              </w:rPr>
+              <w:t>-0.168</w:t>
             </w:r>
           </w:p>
         </w:tc>
@@ -4115,45 +4115,45 @@
                 <w:b w:val="0"/>
                 <w:sz w:val="18"/>
               </w:rPr>
-              <w:t>-0.315*</w:t>
-            </w:r>
-          </w:p>
-        </w:tc>
-        <w:tc>
-          <w:tcPr>
-            <w:tcW w:type="dxa" w:w="936"/>
-          </w:tcPr>
-          <w:p>
-            <w:pPr>
-              <w:jc w:val="center"/>
-            </w:pPr>
-            <w:r/>
-            <w:r>
-              <w:rPr>
-                <w:rFonts w:ascii="Helvetica" w:hAnsi="Helvetica"/>
-                <w:b w:val="0"/>
-                <w:sz w:val="18"/>
-              </w:rPr>
-              <w:t>(0.145)</w:t>
-            </w:r>
-          </w:p>
-        </w:tc>
-        <w:tc>
-          <w:tcPr>
-            <w:tcW w:type="dxa" w:w="936"/>
-          </w:tcPr>
-          <w:p>
-            <w:pPr>
-              <w:jc w:val="center"/>
-            </w:pPr>
-            <w:r/>
-            <w:r>
-              <w:rPr>
-                <w:rFonts w:ascii="Helvetica" w:hAnsi="Helvetica"/>
-                <w:b w:val="0"/>
-                <w:sz w:val="18"/>
-              </w:rPr>
-              <w:t>-0.203</w:t>
+              <w:t>-0.329*</w:t>
+            </w:r>
+          </w:p>
+        </w:tc>
+        <w:tc>
+          <w:tcPr>
+            <w:tcW w:type="dxa" w:w="936"/>
+          </w:tcPr>
+          <w:p>
+            <w:pPr>
+              <w:jc w:val="center"/>
+            </w:pPr>
+            <w:r/>
+            <w:r>
+              <w:rPr>
+                <w:rFonts w:ascii="Helvetica" w:hAnsi="Helvetica"/>
+                <w:b w:val="0"/>
+                <w:sz w:val="18"/>
+              </w:rPr>
+              <w:t>(0.138)</w:t>
+            </w:r>
+          </w:p>
+        </w:tc>
+        <w:tc>
+          <w:tcPr>
+            <w:tcW w:type="dxa" w:w="936"/>
+          </w:tcPr>
+          <w:p>
+            <w:pPr>
+              <w:jc w:val="center"/>
+            </w:pPr>
+            <w:r/>
+            <w:r>
+              <w:rPr>
+                <w:rFonts w:ascii="Helvetica" w:hAnsi="Helvetica"/>
+                <w:b w:val="0"/>
+                <w:sz w:val="18"/>
+              </w:rPr>
+              <w:t>-0.211</w:t>
             </w:r>
           </w:p>
         </w:tc>
@@ -4304,45 +4304,45 @@
                 <w:b w:val="0"/>
                 <w:sz w:val="18"/>
               </w:rPr>
-              <w:t>0.039</w:t>
-            </w:r>
-          </w:p>
-        </w:tc>
-        <w:tc>
-          <w:tcPr>
-            <w:tcW w:type="dxa" w:w="936"/>
-          </w:tcPr>
-          <w:p>
-            <w:pPr>
-              <w:jc w:val="center"/>
-            </w:pPr>
-            <w:r/>
-            <w:r>
-              <w:rPr>
-                <w:rFonts w:ascii="Helvetica" w:hAnsi="Helvetica"/>
-                <w:b w:val="0"/>
-                <w:sz w:val="18"/>
-              </w:rPr>
-              <w:t>(0.163)</w:t>
-            </w:r>
-          </w:p>
-        </w:tc>
-        <w:tc>
-          <w:tcPr>
-            <w:tcW w:type="dxa" w:w="936"/>
-          </w:tcPr>
-          <w:p>
-            <w:pPr>
-              <w:jc w:val="center"/>
-            </w:pPr>
-            <w:r/>
-            <w:r>
-              <w:rPr>
-                <w:rFonts w:ascii="Helvetica" w:hAnsi="Helvetica"/>
-                <w:b w:val="0"/>
-                <w:sz w:val="18"/>
-              </w:rPr>
-              <w:t>0.025</w:t>
+              <w:t>-0.005</w:t>
+            </w:r>
+          </w:p>
+        </w:tc>
+        <w:tc>
+          <w:tcPr>
+            <w:tcW w:type="dxa" w:w="936"/>
+          </w:tcPr>
+          <w:p>
+            <w:pPr>
+              <w:jc w:val="center"/>
+            </w:pPr>
+            <w:r/>
+            <w:r>
+              <w:rPr>
+                <w:rFonts w:ascii="Helvetica" w:hAnsi="Helvetica"/>
+                <w:b w:val="0"/>
+                <w:sz w:val="18"/>
+              </w:rPr>
+              <w:t>(0.155)</w:t>
+            </w:r>
+          </w:p>
+        </w:tc>
+        <w:tc>
+          <w:tcPr>
+            <w:tcW w:type="dxa" w:w="936"/>
+          </w:tcPr>
+          <w:p>
+            <w:pPr>
+              <w:jc w:val="center"/>
+            </w:pPr>
+            <w:r/>
+            <w:r>
+              <w:rPr>
+                <w:rFonts w:ascii="Helvetica" w:hAnsi="Helvetica"/>
+                <w:b w:val="0"/>
+                <w:sz w:val="18"/>
+              </w:rPr>
+              <w:t>-0.003</w:t>
             </w:r>
           </w:p>
         </w:tc>

</xml_diff>